<commit_message>
fix(p9): fill cover-letter submission date (20 June 2026)
Co-Authored-By: Claude Opus 4.8 (1M context) <noreply@anthropic.com>
Claude-Session: https://claude.ai/code/session_01Xumaoraa2DLWLXsgJJ62oq
</commit_message>
<xml_diff>
--- a/dist/BO_NOP_HOAN_CHINH_2026-06/1_papers/P9_MIR/03_cover_letter.docx
+++ b/dist/BO_NOP_HOAN_CHINH_2026-06/1_papers/P9_MIR/03_cover_letter.docx
@@ -7,7 +7,7 @@
         <w:pStyle w:val="FirstParagraph"/>
       </w:pPr>
       <w:r>
-        <w:t xml:space="preserve">[Date of submission]</w:t>
+        <w:t xml:space="preserve">20 June 2026</w:t>
       </w:r>
     </w:p>
     <w:p>
@@ -826,7 +826,10 @@
         <w:t xml:space="preserve">Email: patu@ctu.edu.vn | ORCID: 0000-0003-0667-3137</w:t>
       </w:r>
     </w:p>
-    <w:sectPr/>
+    <w:sectPr>
+      <w:pgSz w:h="16838" w:w="11906"/>
+      <w:pgMar w:bottom="1417" w:left="1417" w:right="1417" w:top="1417"/>
+    </w:sectPr>
   </w:body>
 </w:document>
 </file>
@@ -1038,29 +1041,59 @@
   <w:style w:default="1" w:styleId="Normal" w:type="paragraph">
     <w:name w:val="Normal"/>
     <w:qFormat/>
+    <w:pPr>
+      <w:spacing w:line="276" w:lineRule="auto"/>
+      <w:jc w:val="both"/>
+    </w:pPr>
+    <w:rPr>
+      <w:rFonts w:ascii="Times New Roman" w:eastAsia="Times New Roman" w:hAnsi="Times New Roman"/>
+      <w:color w:val="000000"/>
+      <w:sz w:val="24"/>
+    </w:rPr>
   </w:style>
   <w:style w:styleId="BodyText" w:type="paragraph">
     <w:name w:val="Body Text"/>
     <w:basedOn w:val="Normal"/>
     <w:link w:val="BodyTextChar"/>
     <w:pPr>
-      <w:spacing w:after="180" w:before="180"/>
-    </w:pPr>
-    <w:qFormat/>
+      <w:spacing w:after="180" w:before="180" w:line="276" w:lineRule="auto"/>
+      <w:jc w:val="both"/>
+    </w:pPr>
+    <w:qFormat/>
+    <w:rPr>
+      <w:rFonts w:ascii="Times New Roman" w:eastAsia="Times New Roman" w:hAnsi="Times New Roman"/>
+      <w:color w:val="000000"/>
+      <w:sz w:val="24"/>
+    </w:rPr>
   </w:style>
   <w:style w:customStyle="1" w:styleId="FirstParagraph" w:type="paragraph">
     <w:name w:val="First Paragraph"/>
     <w:basedOn w:val="BodyText"/>
     <w:next w:val="BodyText"/>
     <w:qFormat/>
+    <w:pPr>
+      <w:spacing w:line="276" w:lineRule="auto"/>
+      <w:jc w:val="both"/>
+    </w:pPr>
+    <w:rPr>
+      <w:rFonts w:ascii="Times New Roman" w:eastAsia="Times New Roman" w:hAnsi="Times New Roman"/>
+      <w:color w:val="000000"/>
+      <w:sz w:val="24"/>
+    </w:rPr>
   </w:style>
   <w:style w:customStyle="1" w:styleId="Compact" w:type="paragraph">
     <w:name w:val="Compact"/>
     <w:basedOn w:val="BodyText"/>
     <w:qFormat/>
     <w:pPr>
-      <w:spacing w:after="36" w:before="36"/>
-    </w:pPr>
+      <w:spacing w:after="36" w:before="36" w:line="276" w:lineRule="auto"/>
+      <w:jc w:val="both"/>
+    </w:pPr>
+    <w:rPr>
+      <w:rFonts w:ascii="Times New Roman" w:eastAsia="Times New Roman" w:hAnsi="Times New Roman"/>
+      <w:color w:val="000000"/>
+      <w:sz w:val="24"/>
+    </w:rPr>
   </w:style>
   <w:style w:styleId="Title" w:type="paragraph">
     <w:name w:val="Title"/>
@@ -1070,15 +1103,15 @@
     <w:pPr>
       <w:keepNext/>
       <w:keepLines/>
-      <w:spacing w:after="240" w:before="480"/>
-      <w:jc w:val="center"/>
-    </w:pPr>
-    <w:rPr>
-      <w:rFonts w:asciiTheme="majorHAnsi" w:cstheme="majorBidi" w:eastAsiaTheme="majorEastAsia" w:hAnsiTheme="majorHAnsi"/>
+      <w:spacing w:after="240" w:before="480" w:line="276" w:lineRule="auto"/>
+      <w:jc w:val="both"/>
+    </w:pPr>
+    <w:rPr>
+      <w:rFonts w:ascii="Times New Roman" w:asciiTheme="majorHAnsi" w:cstheme="majorBidi" w:eastAsia="Times New Roman" w:eastAsiaTheme="majorEastAsia" w:hAnsi="Times New Roman" w:hAnsiTheme="majorHAnsi"/>
       <w:b/>
       <w:bCs/>
-      <w:color w:themeColor="accent1" w:themeShade="B5" w:val="345A8A"/>
-      <w:sz w:val="36"/>
+      <w:color w:val="000000"/>
+      <w:sz w:val="24"/>
       <w:szCs w:val="36"/>
     </w:rPr>
   </w:style>
@@ -1090,11 +1123,13 @@
     <w:pPr>
       <w:keepNext/>
       <w:keepLines/>
-      <w:spacing w:after="240" w:before="240"/>
-      <w:jc w:val="center"/>
-    </w:pPr>
-    <w:rPr>
-      <w:sz w:val="30"/>
+      <w:spacing w:after="240" w:before="240" w:line="276" w:lineRule="auto"/>
+      <w:jc w:val="both"/>
+    </w:pPr>
+    <w:rPr>
+      <w:rFonts w:ascii="Times New Roman" w:eastAsia="Times New Roman" w:hAnsi="Times New Roman"/>
+      <w:color w:val="000000"/>
+      <w:sz w:val="24"/>
       <w:szCs w:val="30"/>
     </w:rPr>
   </w:style>
@@ -1105,8 +1140,14 @@
     <w:pPr>
       <w:keepNext/>
       <w:keepLines/>
-      <w:jc w:val="center"/>
-    </w:pPr>
+      <w:spacing w:line="276" w:lineRule="auto"/>
+      <w:jc w:val="both"/>
+    </w:pPr>
+    <w:rPr>
+      <w:rFonts w:ascii="Times New Roman" w:eastAsia="Times New Roman" w:hAnsi="Times New Roman"/>
+      <w:color w:val="000000"/>
+      <w:sz w:val="24"/>
+    </w:rPr>
   </w:style>
   <w:style w:styleId="Date" w:type="paragraph">
     <w:name w:val="Date"/>
@@ -1115,8 +1156,14 @@
     <w:pPr>
       <w:keepNext/>
       <w:keepLines/>
-      <w:jc w:val="center"/>
-    </w:pPr>
+      <w:spacing w:line="276" w:lineRule="auto"/>
+      <w:jc w:val="both"/>
+    </w:pPr>
+    <w:rPr>
+      <w:rFonts w:ascii="Times New Roman" w:eastAsia="Times New Roman" w:hAnsi="Times New Roman"/>
+      <w:color w:val="000000"/>
+      <w:sz w:val="24"/>
+    </w:rPr>
   </w:style>
   <w:style w:customStyle="1" w:styleId="AbstractTitle" w:type="paragraph">
     <w:name w:val="Abstract Title"/>
@@ -1126,15 +1173,15 @@
     <w:pPr>
       <w:keepNext/>
       <w:keepLines/>
-      <w:jc w:val="center"/>
-      <w:spacing w:after="0" w:before="300"/>
-    </w:pPr>
-    <w:rPr>
-      <w:sz w:val="20"/>
+      <w:jc w:val="both"/>
+      <w:spacing w:after="0" w:before="300" w:line="276" w:lineRule="auto"/>
+    </w:pPr>
+    <w:rPr>
+      <w:color w:val="000000"/>
+      <w:sz w:val="24"/>
       <w:szCs w:val="20"/>
+      <w:rFonts w:ascii="Times New Roman" w:eastAsia="Times New Roman" w:hAnsi="Times New Roman"/>
       <w:b/>
-      <w:color w:val="345A8A"/>
-      &gt;
     </w:rPr>
   </w:style>
   <w:style w:customStyle="1" w:styleId="Abstract" w:type="paragraph">
@@ -1145,10 +1192,13 @@
     <w:pPr>
       <w:keepNext/>
       <w:keepLines/>
-      <w:spacing w:after="300" w:before="100"/>
-    </w:pPr>
-    <w:rPr>
-      <w:sz w:val="20"/>
+      <w:spacing w:after="300" w:before="100" w:line="276" w:lineRule="auto"/>
+      <w:jc w:val="both"/>
+    </w:pPr>
+    <w:rPr>
+      <w:rFonts w:ascii="Times New Roman" w:eastAsia="Times New Roman" w:hAnsi="Times New Roman"/>
+      <w:color w:val="000000"/>
+      <w:sz w:val="24"/>
       <w:szCs w:val="20"/>
     </w:rPr>
   </w:style>
@@ -1157,8 +1207,15 @@
     <w:basedOn w:val="Normal"/>
     <w:next w:val="Bibliography"/>
     <w:qFormat/>
-    <w:pPr/>
-    <w:rPr/>
+    <w:pPr>
+      <w:spacing w:line="276" w:lineRule="auto"/>
+      <w:jc w:val="both"/>
+    </w:pPr>
+    <w:rPr>
+      <w:rFonts w:ascii="Times New Roman" w:eastAsia="Times New Roman" w:hAnsi="Times New Roman"/>
+      <w:color w:val="000000"/>
+      <w:sz w:val="24"/>
+    </w:rPr>
   </w:style>
   <w:style w:styleId="Heading1" w:type="paragraph">
     <w:name w:val="Heading 1"/>
@@ -1169,15 +1226,16 @@
     <w:pPr>
       <w:keepNext/>
       <w:keepLines/>
-      <w:spacing w:after="0" w:before="480"/>
+      <w:spacing w:after="0" w:before="480" w:line="276" w:lineRule="auto"/>
+      <w:jc w:val="both"/>
       <w:outlineLvl w:val="0"/>
     </w:pPr>
     <w:rPr>
-      <w:rFonts w:asciiTheme="majorHAnsi" w:cstheme="majorBidi" w:eastAsiaTheme="majorEastAsia" w:hAnsiTheme="majorHAnsi"/>
+      <w:rFonts w:ascii="Times New Roman" w:asciiTheme="majorHAnsi" w:cstheme="majorBidi" w:eastAsia="Times New Roman" w:eastAsiaTheme="majorEastAsia" w:hAnsi="Times New Roman" w:hAnsiTheme="majorHAnsi"/>
       <w:b/>
       <w:bCs/>
-      <w:color w:themeColor="accent1" w:val="4F81BD"/>
-      <w:sz w:val="32"/>
+      <w:color w:val="000000"/>
+      <w:sz w:val="24"/>
       <w:szCs w:val="32"/>
     </w:rPr>
   </w:style>
@@ -1191,15 +1249,16 @@
     <w:pPr>
       <w:keepNext/>
       <w:keepLines/>
-      <w:spacing w:after="0" w:before="200"/>
+      <w:spacing w:after="0" w:before="200" w:line="276" w:lineRule="auto"/>
+      <w:jc w:val="both"/>
       <w:outlineLvl w:val="1"/>
     </w:pPr>
     <w:rPr>
-      <w:rFonts w:asciiTheme="majorHAnsi" w:cstheme="majorBidi" w:eastAsiaTheme="majorEastAsia" w:hAnsiTheme="majorHAnsi"/>
+      <w:rFonts w:ascii="Times New Roman" w:asciiTheme="majorHAnsi" w:cstheme="majorBidi" w:eastAsia="Times New Roman" w:eastAsiaTheme="majorEastAsia" w:hAnsi="Times New Roman" w:hAnsiTheme="majorHAnsi"/>
       <w:b/>
       <w:bCs/>
-      <w:color w:themeColor="accent1" w:val="4F81BD"/>
-      <w:sz w:val="28"/>
+      <w:color w:val="000000"/>
+      <w:sz w:val="24"/>
       <w:szCs w:val="28"/>
     </w:rPr>
   </w:style>
@@ -1213,14 +1272,15 @@
     <w:pPr>
       <w:keepNext/>
       <w:keepLines/>
-      <w:spacing w:after="0" w:before="200"/>
+      <w:spacing w:after="0" w:before="200" w:line="276" w:lineRule="auto"/>
+      <w:jc w:val="both"/>
       <w:outlineLvl w:val="2"/>
     </w:pPr>
     <w:rPr>
-      <w:rFonts w:asciiTheme="majorHAnsi" w:cstheme="majorBidi" w:eastAsiaTheme="majorEastAsia" w:hAnsiTheme="majorHAnsi"/>
+      <w:rFonts w:ascii="Times New Roman" w:asciiTheme="majorHAnsi" w:cstheme="majorBidi" w:eastAsia="Times New Roman" w:eastAsiaTheme="majorEastAsia" w:hAnsi="Times New Roman" w:hAnsiTheme="majorHAnsi"/>
       <w:b/>
       <w:bCs/>
-      <w:color w:themeColor="accent1" w:val="4F81BD"/>
+      <w:color w:val="000000"/>
       <w:sz w:val="24"/>
       <w:szCs w:val="24"/>
     </w:rPr>
@@ -1235,14 +1295,15 @@
     <w:pPr>
       <w:keepNext/>
       <w:keepLines/>
-      <w:spacing w:after="0" w:before="200"/>
+      <w:spacing w:after="0" w:before="200" w:line="276" w:lineRule="auto"/>
+      <w:jc w:val="both"/>
       <w:outlineLvl w:val="3"/>
     </w:pPr>
     <w:rPr>
-      <w:rFonts w:asciiTheme="majorHAnsi" w:cstheme="majorBidi" w:eastAsiaTheme="majorEastAsia" w:hAnsiTheme="majorHAnsi"/>
+      <w:rFonts w:ascii="Times New Roman" w:asciiTheme="majorHAnsi" w:cstheme="majorBidi" w:eastAsia="Times New Roman" w:eastAsiaTheme="majorEastAsia" w:hAnsi="Times New Roman" w:hAnsiTheme="majorHAnsi"/>
       <w:i/>
       <w:bCs/>
-      <w:color w:themeColor="accent1" w:val="4F81BD"/>
+      <w:color w:val="000000"/>
       <w:sz w:val="24"/>
       <w:szCs w:val="24"/>
     </w:rPr>
@@ -1257,13 +1318,14 @@
     <w:pPr>
       <w:keepNext/>
       <w:keepLines/>
-      <w:spacing w:after="0" w:before="200"/>
+      <w:spacing w:after="0" w:before="200" w:line="276" w:lineRule="auto"/>
+      <w:jc w:val="both"/>
       <w:outlineLvl w:val="4"/>
     </w:pPr>
     <w:rPr>
-      <w:rFonts w:asciiTheme="majorHAnsi" w:cstheme="majorBidi" w:eastAsiaTheme="majorEastAsia" w:hAnsiTheme="majorHAnsi"/>
+      <w:rFonts w:ascii="Times New Roman" w:asciiTheme="majorHAnsi" w:cstheme="majorBidi" w:eastAsia="Times New Roman" w:eastAsiaTheme="majorEastAsia" w:hAnsi="Times New Roman" w:hAnsiTheme="majorHAnsi"/>
       <w:iCs/>
-      <w:color w:themeColor="accent1" w:val="4F81BD"/>
+      <w:color w:val="000000"/>
       <w:sz w:val="24"/>
       <w:szCs w:val="24"/>
     </w:rPr>
@@ -1278,12 +1340,13 @@
     <w:pPr>
       <w:keepNext/>
       <w:keepLines/>
-      <w:spacing w:after="0" w:before="200"/>
+      <w:spacing w:after="0" w:before="200" w:line="276" w:lineRule="auto"/>
+      <w:jc w:val="both"/>
       <w:outlineLvl w:val="5"/>
     </w:pPr>
     <w:rPr>
-      <w:rFonts w:asciiTheme="majorHAnsi" w:cstheme="majorBidi" w:eastAsiaTheme="majorEastAsia" w:hAnsiTheme="majorHAnsi"/>
-      <w:color w:themeColor="accent1" w:val="4F81BD"/>
+      <w:rFonts w:ascii="Times New Roman" w:asciiTheme="majorHAnsi" w:cstheme="majorBidi" w:eastAsia="Times New Roman" w:eastAsiaTheme="majorEastAsia" w:hAnsi="Times New Roman" w:hAnsiTheme="majorHAnsi"/>
+      <w:color w:val="000000"/>
       <w:sz w:val="24"/>
       <w:szCs w:val="24"/>
     </w:rPr>
@@ -1298,12 +1361,13 @@
     <w:pPr>
       <w:keepNext/>
       <w:keepLines/>
-      <w:spacing w:after="0" w:before="200"/>
+      <w:spacing w:after="0" w:before="200" w:line="276" w:lineRule="auto"/>
+      <w:jc w:val="both"/>
       <w:outlineLvl w:val="6"/>
     </w:pPr>
     <w:rPr>
-      <w:rFonts w:asciiTheme="majorHAnsi" w:cstheme="majorBidi" w:eastAsiaTheme="majorEastAsia" w:hAnsiTheme="majorHAnsi"/>
-      <w:color w:themeColor="accent1" w:val="4F81BD"/>
+      <w:rFonts w:ascii="Times New Roman" w:asciiTheme="majorHAnsi" w:cstheme="majorBidi" w:eastAsia="Times New Roman" w:eastAsiaTheme="majorEastAsia" w:hAnsi="Times New Roman" w:hAnsiTheme="majorHAnsi"/>
+      <w:color w:val="000000"/>
       <w:sz w:val="24"/>
       <w:szCs w:val="24"/>
     </w:rPr>
@@ -1318,12 +1382,13 @@
     <w:pPr>
       <w:keepNext/>
       <w:keepLines/>
-      <w:spacing w:after="0" w:before="200"/>
+      <w:spacing w:after="0" w:before="200" w:line="276" w:lineRule="auto"/>
+      <w:jc w:val="both"/>
       <w:outlineLvl w:val="7"/>
     </w:pPr>
     <w:rPr>
-      <w:rFonts w:asciiTheme="majorHAnsi" w:cstheme="majorBidi" w:eastAsiaTheme="majorEastAsia" w:hAnsiTheme="majorHAnsi"/>
-      <w:color w:themeColor="accent1" w:val="4F81BD"/>
+      <w:rFonts w:ascii="Times New Roman" w:asciiTheme="majorHAnsi" w:cstheme="majorBidi" w:eastAsia="Times New Roman" w:eastAsiaTheme="majorEastAsia" w:hAnsi="Times New Roman" w:hAnsiTheme="majorHAnsi"/>
+      <w:color w:val="000000"/>
       <w:sz w:val="24"/>
       <w:szCs w:val="24"/>
     </w:rPr>
@@ -1338,12 +1403,13 @@
     <w:pPr>
       <w:keepNext/>
       <w:keepLines/>
-      <w:spacing w:after="0" w:before="200"/>
+      <w:spacing w:after="0" w:before="200" w:line="276" w:lineRule="auto"/>
+      <w:jc w:val="both"/>
       <w:outlineLvl w:val="8"/>
     </w:pPr>
     <w:rPr>
-      <w:rFonts w:asciiTheme="majorHAnsi" w:cstheme="majorBidi" w:eastAsiaTheme="majorEastAsia" w:hAnsiTheme="majorHAnsi"/>
-      <w:color w:themeColor="accent1" w:val="4F81BD"/>
+      <w:rFonts w:ascii="Times New Roman" w:asciiTheme="majorHAnsi" w:cstheme="majorBidi" w:eastAsia="Times New Roman" w:eastAsiaTheme="majorEastAsia" w:hAnsi="Times New Roman" w:hAnsiTheme="majorHAnsi"/>
+      <w:color w:val="000000"/>
       <w:sz w:val="24"/>
       <w:szCs w:val="24"/>
     </w:rPr>
@@ -1356,9 +1422,15 @@
     <w:unhideWhenUsed/>
     <w:qFormat/>
     <w:pPr>
-      <w:spacing w:after="100" w:before="100"/>
+      <w:spacing w:after="100" w:before="100" w:line="276" w:lineRule="auto"/>
       <w:ind w:firstLine="0" w:left="480" w:right="480"/>
-    </w:pPr>
+      <w:jc w:val="both"/>
+    </w:pPr>
+    <w:rPr>
+      <w:rFonts w:ascii="Times New Roman" w:eastAsia="Times New Roman" w:hAnsi="Times New Roman"/>
+      <w:color w:val="000000"/>
+      <w:sz w:val="24"/>
+    </w:rPr>
   </w:style>
   <w:style w:styleId="FootnoteText" w:type="paragraph">
     <w:name w:val="Footnote Text"/>
@@ -1367,11 +1439,25 @@
     <w:uiPriority w:val="9"/>
     <w:unhideWhenUsed/>
     <w:qFormat/>
+    <w:pPr>
+      <w:spacing w:line="276" w:lineRule="auto"/>
+      <w:jc w:val="both"/>
+    </w:pPr>
+    <w:rPr>
+      <w:rFonts w:ascii="Times New Roman" w:eastAsia="Times New Roman" w:hAnsi="Times New Roman"/>
+      <w:color w:val="000000"/>
+      <w:sz w:val="24"/>
+    </w:rPr>
   </w:style>
   <w:style w:default="1" w:styleId="DefaultParagraphFont" w:type="character">
     <w:name w:val="Default Paragraph Font"/>
     <w:semiHidden/>
     <w:unhideWhenUsed/>
+    <w:rPr>
+      <w:rFonts w:ascii="Times New Roman" w:eastAsia="Times New Roman" w:hAnsi="Times New Roman"/>
+      <w:color w:val="000000"/>
+      <w:sz w:val="24"/>
+    </w:rPr>
   </w:style>
   <w:style w:default="1" w:styleId="Table" w:type="table">
     <w:name w:val="Table"/>
@@ -1379,6 +1465,15 @@
     <w:semiHidden/>
     <w:unhideWhenUsed/>
     <w:qFormat/>
+    <w:pPr>
+      <w:spacing w:line="276" w:lineRule="auto"/>
+      <w:jc w:val="both"/>
+    </w:pPr>
+    <w:rPr>
+      <w:rFonts w:ascii="Times New Roman" w:eastAsia="Times New Roman" w:hAnsi="Times New Roman"/>
+      <w:color w:val="000000"/>
+      <w:sz w:val="24"/>
+    </w:rPr>
     <w:tblPr>
       <w:tblInd w:type="dxa" w:w="0"/>
       <w:tblCellMar>
@@ -1411,25 +1506,42 @@
     <w:pPr>
       <w:keepNext/>
       <w:keepLines/>
-      <w:spacing w:after="0"/>
-    </w:pPr>
-    <w:rPr>
+      <w:spacing w:after="0" w:line="276" w:lineRule="auto"/>
+      <w:jc w:val="both"/>
+    </w:pPr>
+    <w:rPr>
+      <w:rFonts w:ascii="Times New Roman" w:eastAsia="Times New Roman" w:hAnsi="Times New Roman"/>
       <w:b/>
+      <w:color w:val="000000"/>
+      <w:sz w:val="24"/>
     </w:rPr>
   </w:style>
   <w:style w:customStyle="1" w:styleId="Definition" w:type="paragraph">
     <w:name w:val="Definition"/>
     <w:basedOn w:val="Normal"/>
+    <w:pPr>
+      <w:spacing w:line="276" w:lineRule="auto"/>
+      <w:jc w:val="both"/>
+    </w:pPr>
+    <w:rPr>
+      <w:rFonts w:ascii="Times New Roman" w:eastAsia="Times New Roman" w:hAnsi="Times New Roman"/>
+      <w:color w:val="000000"/>
+      <w:sz w:val="24"/>
+    </w:rPr>
   </w:style>
   <w:style w:styleId="Caption" w:type="paragraph">
     <w:name w:val="Caption"/>
     <w:basedOn w:val="Normal"/>
     <w:link w:val="BodyTextChar"/>
     <w:pPr>
-      <w:spacing w:after="120" w:before="0"/>
-    </w:pPr>
-    <w:rPr>
+      <w:spacing w:after="120" w:before="0" w:line="276" w:lineRule="auto"/>
+      <w:jc w:val="both"/>
+    </w:pPr>
+    <w:rPr>
+      <w:rFonts w:ascii="Times New Roman" w:eastAsia="Times New Roman" w:hAnsi="Times New Roman"/>
       <w:i/>
+      <w:color w:val="000000"/>
+      <w:sz w:val="24"/>
     </w:rPr>
   </w:style>
   <w:style w:customStyle="1" w:styleId="TableCaption" w:type="paragraph">
@@ -1437,44 +1549,90 @@
     <w:basedOn w:val="Caption"/>
     <w:pPr>
       <w:keepNext/>
-    </w:pPr>
+      <w:spacing w:line="276" w:lineRule="auto"/>
+      <w:jc w:val="both"/>
+    </w:pPr>
+    <w:rPr>
+      <w:rFonts w:ascii="Times New Roman" w:eastAsia="Times New Roman" w:hAnsi="Times New Roman"/>
+      <w:color w:val="000000"/>
+      <w:sz w:val="24"/>
+    </w:rPr>
   </w:style>
   <w:style w:customStyle="1" w:styleId="ImageCaption" w:type="paragraph">
     <w:name w:val="Image Caption"/>
     <w:basedOn w:val="Caption"/>
+    <w:pPr>
+      <w:spacing w:line="276" w:lineRule="auto"/>
+      <w:jc w:val="both"/>
+    </w:pPr>
+    <w:rPr>
+      <w:rFonts w:ascii="Times New Roman" w:eastAsia="Times New Roman" w:hAnsi="Times New Roman"/>
+      <w:color w:val="000000"/>
+      <w:sz w:val="24"/>
+    </w:rPr>
   </w:style>
   <w:style w:customStyle="1" w:styleId="Figure" w:type="paragraph">
     <w:name w:val="Figure"/>
     <w:basedOn w:val="Normal"/>
+    <w:pPr>
+      <w:spacing w:line="276" w:lineRule="auto"/>
+      <w:jc w:val="both"/>
+    </w:pPr>
+    <w:rPr>
+      <w:rFonts w:ascii="Times New Roman" w:eastAsia="Times New Roman" w:hAnsi="Times New Roman"/>
+      <w:color w:val="000000"/>
+      <w:sz w:val="24"/>
+    </w:rPr>
   </w:style>
   <w:style w:customStyle="1" w:styleId="CaptionedFigure" w:type="paragraph">
     <w:name w:val="Captioned Figure"/>
     <w:basedOn w:val="Figure"/>
     <w:pPr>
       <w:keepNext/>
-    </w:pPr>
+      <w:spacing w:line="276" w:lineRule="auto"/>
+      <w:jc w:val="both"/>
+    </w:pPr>
+    <w:rPr>
+      <w:rFonts w:ascii="Times New Roman" w:eastAsia="Times New Roman" w:hAnsi="Times New Roman"/>
+      <w:color w:val="000000"/>
+      <w:sz w:val="24"/>
+    </w:rPr>
   </w:style>
   <w:style w:customStyle="1" w:styleId="BodyTextChar" w:type="character">
     <w:name w:val="Body Text Char"/>
     <w:basedOn w:val="DefaultParagraphFont"/>
     <w:link w:val="BodyText"/>
+    <w:rPr>
+      <w:rFonts w:ascii="Times New Roman" w:eastAsia="Times New Roman" w:hAnsi="Times New Roman"/>
+      <w:color w:val="000000"/>
+      <w:sz w:val="24"/>
+    </w:rPr>
   </w:style>
   <w:style w:customStyle="1" w:styleId="VerbatimChar" w:type="character">
     <w:name w:val="Verbatim Char"/>
     <w:basedOn w:val="BodyTextChar"/>
     <w:rPr>
-      <w:rFonts w:ascii="Consolas" w:hAnsi="Consolas"/>
-      <w:sz w:val="22"/>
+      <w:rFonts w:ascii="Times New Roman" w:eastAsia="Times New Roman" w:hAnsi="Times New Roman"/>
+      <w:color w:val="000000"/>
+      <w:sz w:val="24"/>
     </w:rPr>
   </w:style>
   <w:style w:customStyle="1" w:styleId="SectionNumber" w:type="character">
     <w:name w:val="Section Number"/>
     <w:basedOn w:val="BodyTextChar"/>
+    <w:rPr>
+      <w:rFonts w:ascii="Times New Roman" w:eastAsia="Times New Roman" w:hAnsi="Times New Roman"/>
+      <w:color w:val="000000"/>
+      <w:sz w:val="24"/>
+    </w:rPr>
   </w:style>
   <w:style w:styleId="FootnoteReference" w:type="character">
     <w:name w:val="Footnote Reference"/>
     <w:basedOn w:val="BodyTextChar"/>
     <w:rPr>
+      <w:rFonts w:ascii="Times New Roman" w:eastAsia="Times New Roman" w:hAnsi="Times New Roman"/>
+      <w:color w:val="000000"/>
+      <w:sz w:val="24"/>
       <w:vertAlign w:val="superscript"/>
     </w:rPr>
   </w:style>
@@ -1482,7 +1640,9 @@
     <w:name w:val="Hyperlink"/>
     <w:basedOn w:val="BodyTextChar"/>
     <w:rPr>
-      <w:color w:themeColor="accent1" w:val="4F81BD"/>
+      <w:rFonts w:ascii="Times New Roman" w:eastAsia="Times New Roman" w:hAnsi="Times New Roman"/>
+      <w:color w:val="000000"/>
+      <w:sz w:val="24"/>
     </w:rPr>
   </w:style>
   <w:style w:styleId="TOCHeading" w:type="paragraph">
@@ -1493,14 +1653,16 @@
     <w:unhideWhenUsed/>
     <w:qFormat/>
     <w:pPr>
-      <w:spacing w:before="240" w:line="259" w:lineRule="auto"/>
+      <w:spacing w:before="240" w:line="276" w:lineRule="auto"/>
+      <w:jc w:val="both"/>
       <w:outlineLvl w:val="9"/>
     </w:pPr>
     <w:rPr>
-      <w:rFonts w:asciiTheme="majorHAnsi" w:cstheme="majorBidi" w:eastAsiaTheme="majorEastAsia" w:hAnsiTheme="majorHAnsi"/>
+      <w:rFonts w:ascii="Times New Roman" w:asciiTheme="majorHAnsi" w:cstheme="majorBidi" w:eastAsia="Times New Roman" w:eastAsiaTheme="majorEastAsia" w:hAnsi="Times New Roman" w:hAnsiTheme="majorHAnsi"/>
       <w:b w:val="0"/>
       <w:bCs w:val="0"/>
-      <w:color w:themeColor="accent1" w:themeShade="BF" w:val="365F91"/>
+      <w:color w:val="000000"/>
+      <w:sz w:val="24"/>
     </w:rPr>
   </w:style>
   <w:style w:type="paragraph" w:customStyle="1" w:styleId="SourceCode">

</xml_diff>